<commit_message>
Add Canister Archive and YEEP projects to portfolio
</commit_message>
<xml_diff>
--- a/Jondu_Jesse_CV.docx
+++ b/Jondu_Jesse_CV.docx
@@ -3,263 +3,1153 @@
 <w:document xmlns:wpc="http://schemas.microsoft.com/office/word/2010/wordprocessingCanvas" xmlns:cx="http://schemas.microsoft.com/office/drawing/2014/chartex" xmlns:cx1="http://schemas.microsoft.com/office/drawing/2015/9/8/chartex" xmlns:cx2="http://schemas.microsoft.com/office/drawing/2015/10/21/chartex" xmlns:cx3="http://schemas.microsoft.com/office/drawing/2016/5/9/chartex" xmlns:cx4="http://schemas.microsoft.com/office/drawing/2016/5/10/chartex" xmlns:cx5="http://schemas.microsoft.com/office/drawing/2016/5/11/chartex" xmlns:cx6="http://schemas.microsoft.com/office/drawing/2016/5/12/chartex" xmlns:cx7="http://schemas.microsoft.com/office/drawing/2016/5/13/chartex" xmlns:cx8="http://schemas.microsoft.com/office/drawing/2016/5/14/chartex" xmlns:mc="http://schemas.openxmlformats.org/markup-compatibility/2006" xmlns:aink="http://schemas.microsoft.com/office/drawing/2016/ink" xmlns:am3d="http://schemas.microsoft.com/office/drawing/2017/model3d" xmlns:o="urn:schemas-microsoft-com:office:office" xmlns:r="http://schemas.openxmlformats.org/officeDocument/2006/relationships" xmlns:m="http://schemas.openxmlformats.org/officeDocument/2006/math" xmlns:v="urn:schemas-microsoft-com:vml" xmlns:wp14="http://schemas.microsoft.com/office/word/2010/wordprocessingDrawing" xmlns:wp="http://schemas.openxmlformats.org/drawingml/2006/wordprocessingDrawing" xmlns:w10="urn:schemas-microsoft-com:office:word" xmlns:w="http://schemas.openxmlformats.org/wordprocessingml/2006/main" xmlns:w14="http://schemas.microsoft.com/office/word/2010/wordml" xmlns:w15="http://schemas.microsoft.com/office/word/2012/wordml" xmlns:w16cid="http://schemas.microsoft.com/office/word/2016/wordml/cid" xmlns:w16se="http://schemas.microsoft.com/office/word/2015/wordml/symex" xmlns:wpg="http://schemas.microsoft.com/office/word/2010/wordprocessingGroup" xmlns:wpi="http://schemas.microsoft.com/office/word/2010/wordprocessingInk" xmlns:wne="http://schemas.microsoft.com/office/word/2006/wordml" xmlns:wps="http://schemas.microsoft.com/office/word/2010/wordprocessingShape" mc:Ignorable="w14 w15 w16se w16cid wp14">
   <w:body>
     <w:p>
-      <w:r>
+      <w:pPr>
+        <w:rPr>
+          <w:b/>
+          <w:sz w:val="36"/>
+        </w:rPr>
+      </w:pPr>
+      <w:r>
+        <w:rPr>
+          <w:b/>
+          <w:sz w:val="36"/>
+        </w:rPr>
         <w:t>JONDU JESSE</w:t>
       </w:r>
     </w:p>
     <w:p>
-      <w:r>
+      <w:pPr>
+        <w:rPr>
+          <w:color w:val="000000"/>
+          <w:sz w:val="24"/>
+        </w:rPr>
+      </w:pPr>
+      <w:r>
+        <w:rPr>
+          <w:color w:val="000000"/>
+          <w:sz w:val="24"/>
+        </w:rPr>
         <w:t>IT &amp; Biometric Systems Specialist | Customer Service Professional</w:t>
       </w:r>
     </w:p>
     <w:p>
-      <w:r>
+      <w:pPr>
+        <w:rPr>
+          <w:color w:val="000000"/>
+          <w:sz w:val="24"/>
+        </w:rPr>
+      </w:pPr>
+    </w:p>
+    <w:p>
+      <w:pPr>
+        <w:rPr>
+          <w:color w:val="000000"/>
+          <w:sz w:val="20"/>
+        </w:rPr>
+      </w:pPr>
+      <w:r>
+        <w:rPr>
+          <w:color w:val="000000"/>
+          <w:sz w:val="20"/>
+        </w:rPr>
         <w:t>Phone: +256 754 490 237 | Email: jondujesse@gmail.com</w:t>
       </w:r>
     </w:p>
     <w:p>
-      <w:r>
+      <w:pPr>
+        <w:rPr>
+          <w:color w:val="000000"/>
+          <w:sz w:val="20"/>
+        </w:rPr>
+      </w:pPr>
+      <w:r>
+        <w:rPr>
+          <w:color w:val="000000"/>
+          <w:sz w:val="20"/>
+        </w:rPr>
         <w:t>Portfolio: https://portfolio-5b977.web.app/ | GitHub: github.com/jessethegreat6190</w:t>
       </w:r>
     </w:p>
-    <w:p/>
-    <w:p>
-      <w:r>
+    <w:p>
+      <w:pPr>
+        <w:rPr>
+          <w:color w:val="000000"/>
+          <w:sz w:val="20"/>
+        </w:rPr>
+      </w:pPr>
+    </w:p>
+    <w:p>
+      <w:pPr>
+        <w:rPr>
+          <w:b/>
+          <w:color w:val="000000"/>
+          <w:sz w:val="26"/>
+          <w:u w:val="single"/>
+        </w:rPr>
+      </w:pPr>
+      <w:r>
+        <w:rPr>
+          <w:b/>
+          <w:color w:val="000000"/>
+          <w:sz w:val="26"/>
+          <w:u w:val="single"/>
+        </w:rPr>
         <w:t>Professional Summary</w:t>
       </w:r>
     </w:p>
     <w:p>
-      <w:r>
-        <w:t>Detail-oriented IT professional with hands-on experience in biometric data collection systems, customer-facing technical support, and equipment management. Developed and tested biometric enrollment features including fingerprint capture, webcam-based photo acquisition, and OCR ID document scanning. Fluent in English and Luganda with a strong commitment to accuracy, data security, and delivering quality service in fast-paced environments.</w:t>
-      </w:r>
-    </w:p>
-    <w:p/>
-    <w:p>
-      <w:r>
+      <w:pPr>
+        <w:rPr>
+          <w:color w:val="000000"/>
+        </w:rPr>
+      </w:pPr>
+      <w:r>
+        <w:rPr>
+          <w:color w:val="000000"/>
+        </w:rPr>
+        <w:t xml:space="preserve">Detail-oriented IT professional with hands-on experience in </w:t>
+      </w:r>
+      <w:r>
+        <w:rPr>
+          <w:b/>
+          <w:color w:val="000000"/>
+        </w:rPr>
+        <w:t>biometric data collection</w:t>
+      </w:r>
+      <w:r>
+        <w:rPr>
+          <w:color w:val="000000"/>
+        </w:rPr>
+        <w:t xml:space="preserve"> systems, customer-facing technical support, and equipment management. Developed and tested biometric enrollment features including </w:t>
+      </w:r>
+      <w:r>
+        <w:rPr>
+          <w:b/>
+          <w:color w:val="000000"/>
+        </w:rPr>
+        <w:t>fingerprint capture</w:t>
+      </w:r>
+      <w:r>
+        <w:rPr>
+          <w:color w:val="000000"/>
+        </w:rPr>
+        <w:t xml:space="preserve">, </w:t>
+      </w:r>
+      <w:r>
+        <w:rPr>
+          <w:b/>
+          <w:color w:val="000000"/>
+        </w:rPr>
+        <w:t>webcam-based photo acquisition</w:t>
+      </w:r>
+      <w:r>
+        <w:rPr>
+          <w:color w:val="000000"/>
+        </w:rPr>
+        <w:t xml:space="preserve">, and </w:t>
+      </w:r>
+      <w:r>
+        <w:rPr>
+          <w:b/>
+          <w:color w:val="000000"/>
+        </w:rPr>
+        <w:t>OCR ID document scanning</w:t>
+      </w:r>
+      <w:r>
+        <w:rPr>
+          <w:color w:val="000000"/>
+        </w:rPr>
+        <w:t xml:space="preserve">. Fluent in </w:t>
+      </w:r>
+      <w:r>
+        <w:rPr>
+          <w:b/>
+          <w:color w:val="000000"/>
+        </w:rPr>
+        <w:t>English</w:t>
+      </w:r>
+      <w:r>
+        <w:rPr>
+          <w:color w:val="000000"/>
+        </w:rPr>
+        <w:t xml:space="preserve"> and </w:t>
+      </w:r>
+      <w:r>
+        <w:rPr>
+          <w:b/>
+          <w:color w:val="000000"/>
+        </w:rPr>
+        <w:t>Luganda</w:t>
+      </w:r>
+      <w:r>
+        <w:rPr>
+          <w:color w:val="000000"/>
+        </w:rPr>
+        <w:t xml:space="preserve"> with a strong commitment to </w:t>
+      </w:r>
+      <w:r>
+        <w:rPr>
+          <w:b/>
+          <w:color w:val="000000"/>
+        </w:rPr>
+        <w:t>accuracy</w:t>
+      </w:r>
+      <w:r>
+        <w:rPr>
+          <w:color w:val="000000"/>
+        </w:rPr>
+        <w:t xml:space="preserve">, </w:t>
+      </w:r>
+      <w:r>
+        <w:rPr>
+          <w:b/>
+          <w:color w:val="000000"/>
+        </w:rPr>
+        <w:t>data security</w:t>
+      </w:r>
+      <w:r>
+        <w:rPr>
+          <w:color w:val="000000"/>
+        </w:rPr>
+        <w:t>, and delivering quality service in fast-paced environments.</w:t>
+      </w:r>
+    </w:p>
+    <w:p>
+      <w:pPr>
+        <w:rPr>
+          <w:color w:val="000000"/>
+        </w:rPr>
+      </w:pPr>
+    </w:p>
+    <w:p>
+      <w:pPr>
+        <w:rPr>
+          <w:b/>
+          <w:color w:val="000000"/>
+          <w:sz w:val="26"/>
+          <w:u w:val="single"/>
+        </w:rPr>
+      </w:pPr>
+      <w:r>
+        <w:rPr>
+          <w:b/>
+          <w:color w:val="000000"/>
+          <w:sz w:val="26"/>
+          <w:u w:val="single"/>
+        </w:rPr>
         <w:t>Core Skills</w:t>
       </w:r>
     </w:p>
     <w:p>
-      <w:r>
-        <w:t>- Biometric data collection (fingerprint, photo, ID scanning)</w:t>
-      </w:r>
-    </w:p>
-    <w:p>
-      <w:r>
-        <w:t>- Customer service &amp; applicant assistance</w:t>
-      </w:r>
-    </w:p>
-    <w:p>
-      <w:r>
-        <w:t>- IT equipment operation &amp; maintenance</w:t>
-      </w:r>
-    </w:p>
-    <w:p>
-      <w:r>
-        <w:t>- Data security &amp; confidentiality protocols</w:t>
-      </w:r>
-    </w:p>
-    <w:p>
-      <w:r>
-        <w:t>- Accuracy-focused quality assurance</w:t>
-      </w:r>
-    </w:p>
-    <w:p>
-      <w:r>
-        <w:t>- Fast-paced workflow &amp; multitasking</w:t>
-      </w:r>
-    </w:p>
-    <w:p>
-      <w:r>
-        <w:t>- English &amp; Luganda fluency</w:t>
-      </w:r>
-    </w:p>
-    <w:p/>
-    <w:p>
-      <w:r>
+      <w:pPr>
+        <w:rPr>
+          <w:color w:val="000000"/>
+        </w:rPr>
+      </w:pPr>
+      <w:r>
+        <w:rPr>
+          <w:color w:val="000000"/>
+        </w:rPr>
+        <w:t xml:space="preserve">• </w:t>
+      </w:r>
+      <w:r>
+        <w:rPr>
+          <w:b/>
+          <w:color w:val="000000"/>
+        </w:rPr>
+        <w:t>Biometric data collection</w:t>
+      </w:r>
+      <w:r>
+        <w:rPr>
+          <w:color w:val="000000"/>
+        </w:rPr>
+        <w:t xml:space="preserve"> (fingerprint, photo, ID scanning)</w:t>
+      </w:r>
+    </w:p>
+    <w:p>
+      <w:pPr>
+        <w:rPr>
+          <w:color w:val="000000"/>
+        </w:rPr>
+      </w:pPr>
+      <w:r>
+        <w:rPr>
+          <w:color w:val="000000"/>
+        </w:rPr>
+        <w:t xml:space="preserve">• </w:t>
+      </w:r>
+      <w:r>
+        <w:rPr>
+          <w:b/>
+          <w:color w:val="000000"/>
+        </w:rPr>
+        <w:t>Customer service</w:t>
+      </w:r>
+      <w:r>
+        <w:rPr>
+          <w:color w:val="000000"/>
+        </w:rPr>
+        <w:t xml:space="preserve"> &amp; applicant assistance</w:t>
+      </w:r>
+    </w:p>
+    <w:p>
+      <w:pPr>
+        <w:rPr>
+          <w:color w:val="000000"/>
+        </w:rPr>
+      </w:pPr>
+      <w:r>
+        <w:rPr>
+          <w:color w:val="000000"/>
+        </w:rPr>
+        <w:t>• IT equipment operation &amp; maintenance</w:t>
+      </w:r>
+    </w:p>
+    <w:p>
+      <w:pPr>
+        <w:rPr>
+          <w:color w:val="000000"/>
+        </w:rPr>
+      </w:pPr>
+      <w:r>
+        <w:rPr>
+          <w:color w:val="000000"/>
+        </w:rPr>
+        <w:t xml:space="preserve">• </w:t>
+      </w:r>
+      <w:r>
+        <w:rPr>
+          <w:b/>
+          <w:color w:val="000000"/>
+        </w:rPr>
+        <w:t>Data security</w:t>
+      </w:r>
+      <w:r>
+        <w:rPr>
+          <w:color w:val="000000"/>
+        </w:rPr>
+        <w:t xml:space="preserve"> &amp; confidentiality protocols</w:t>
+      </w:r>
+    </w:p>
+    <w:p>
+      <w:pPr>
+        <w:rPr>
+          <w:color w:val="000000"/>
+        </w:rPr>
+      </w:pPr>
+      <w:r>
+        <w:rPr>
+          <w:color w:val="000000"/>
+        </w:rPr>
+        <w:t xml:space="preserve">• </w:t>
+      </w:r>
+      <w:r>
+        <w:rPr>
+          <w:b/>
+          <w:color w:val="000000"/>
+        </w:rPr>
+        <w:t>Accuracy</w:t>
+      </w:r>
+      <w:r>
+        <w:rPr>
+          <w:color w:val="000000"/>
+        </w:rPr>
+        <w:t>-focused quality assurance</w:t>
+      </w:r>
+    </w:p>
+    <w:p>
+      <w:pPr>
+        <w:rPr>
+          <w:color w:val="000000"/>
+        </w:rPr>
+      </w:pPr>
+      <w:r>
+        <w:rPr>
+          <w:color w:val="000000"/>
+        </w:rPr>
+        <w:t>• Fast-paced workflow &amp; multitasking</w:t>
+      </w:r>
+    </w:p>
+    <w:p>
+      <w:pPr>
+        <w:rPr>
+          <w:color w:val="000000"/>
+        </w:rPr>
+      </w:pPr>
+      <w:r>
+        <w:rPr>
+          <w:color w:val="000000"/>
+        </w:rPr>
+        <w:t xml:space="preserve">• </w:t>
+      </w:r>
+      <w:r>
+        <w:rPr>
+          <w:b/>
+          <w:color w:val="000000"/>
+        </w:rPr>
+        <w:t>English &amp; Luganda</w:t>
+      </w:r>
+      <w:r>
+        <w:rPr>
+          <w:color w:val="000000"/>
+        </w:rPr>
+        <w:t xml:space="preserve"> fluency</w:t>
+      </w:r>
+    </w:p>
+    <w:p>
+      <w:pPr>
+        <w:rPr>
+          <w:color w:val="000000"/>
+        </w:rPr>
+      </w:pPr>
+    </w:p>
+    <w:p>
+      <w:pPr>
+        <w:rPr>
+          <w:b/>
+          <w:color w:val="000000"/>
+          <w:sz w:val="26"/>
+          <w:u w:val="single"/>
+        </w:rPr>
+      </w:pPr>
+      <w:r>
+        <w:rPr>
+          <w:b/>
+          <w:color w:val="000000"/>
+          <w:sz w:val="26"/>
+          <w:u w:val="single"/>
+        </w:rPr>
         <w:t>Education</w:t>
       </w:r>
     </w:p>
     <w:p>
-      <w:r>
-        <w:t>Diploma in Information Technology — ISBAT University, Kampala (Ongoing)</w:t>
-      </w:r>
-    </w:p>
-    <w:p>
-      <w:r>
-        <w:t>- Coursework includes database management, networking, systems analysis, and IT security</w:t>
-      </w:r>
-    </w:p>
-    <w:p/>
-    <w:p>
-      <w:r>
+      <w:pPr>
+        <w:rPr>
+          <w:color w:val="000000"/>
+        </w:rPr>
+      </w:pPr>
+      <w:r>
+        <w:rPr>
+          <w:b/>
+          <w:color w:val="000000"/>
+        </w:rPr>
+        <w:t>Diploma in Information Technology</w:t>
+      </w:r>
+      <w:r>
+        <w:rPr>
+          <w:color w:val="000000"/>
+        </w:rPr>
+        <w:t xml:space="preserve"> — ISBAT University, Kampala</w:t>
+      </w:r>
+    </w:p>
+    <w:p>
+      <w:pPr>
+        <w:rPr>
+          <w:color w:val="000000"/>
+        </w:rPr>
+      </w:pPr>
+      <w:r>
+        <w:rPr>
+          <w:b/>
+          <w:color w:val="000000"/>
+        </w:rPr>
+        <w:t>Final Semester Completed (June 2026)</w:t>
+      </w:r>
+      <w:r>
+        <w:rPr>
+          <w:color w:val="000000"/>
+        </w:rPr>
+        <w:t xml:space="preserve"> — Coursework includes database management, networking, systems analysis, and IT security</w:t>
+      </w:r>
+    </w:p>
+    <w:p>
+      <w:pPr>
+        <w:rPr>
+          <w:color w:val="000000"/>
+        </w:rPr>
+      </w:pPr>
+    </w:p>
+    <w:p>
+      <w:pPr>
+        <w:rPr>
+          <w:b/>
+          <w:color w:val="000000"/>
+          <w:sz w:val="26"/>
+          <w:u w:val="single"/>
+        </w:rPr>
+      </w:pPr>
+      <w:r>
+        <w:rPr>
+          <w:b/>
+          <w:color w:val="000000"/>
+          <w:sz w:val="26"/>
+          <w:u w:val="single"/>
+        </w:rPr>
         <w:t>Experience</w:t>
       </w:r>
     </w:p>
     <w:p>
-      <w:r>
+      <w:pPr>
+        <w:rPr>
+          <w:color w:val="000000"/>
+        </w:rPr>
+      </w:pPr>
+      <w:r>
+        <w:rPr>
+          <w:color w:val="000000"/>
+        </w:rPr>
         <w:t>IT Support &amp; Biometric Systems Developer</w:t>
       </w:r>
     </w:p>
     <w:p>
-      <w:r>
+      <w:pPr>
+        <w:rPr>
+          <w:color w:val="000000"/>
+          <w:sz w:val="20"/>
+        </w:rPr>
+      </w:pPr>
+      <w:r>
+        <w:rPr>
+          <w:color w:val="000000"/>
+          <w:sz w:val="20"/>
+        </w:rPr>
         <w:t>Freelance / Project-Based | 2024 – Present</w:t>
       </w:r>
     </w:p>
     <w:p>
-      <w:r>
-        <w:t>- Developed and tested biometric enrollment systems including fingerprint capture, webcam-based photo acquisition, and OCR ID document scanning for identity verification</w:t>
-      </w:r>
-    </w:p>
-    <w:p>
-      <w:r>
-        <w:t>- Operated and maintained IT equipment ensuring reliable performance during all operations</w:t>
-      </w:r>
-    </w:p>
-    <w:p>
-      <w:r>
-        <w:t>- Assisted users through technical processes with patience and clear communication</w:t>
-      </w:r>
-    </w:p>
-    <w:p>
-      <w:r>
-        <w:t>- Maintained strict data security protocols when handling sensitive personal information</w:t>
-      </w:r>
-    </w:p>
-    <w:p>
-      <w:r>
-        <w:t>- Managed multiple tasks simultaneously in deadline-driven environments</w:t>
-      </w:r>
-    </w:p>
-    <w:p/>
-    <w:p>
-      <w:r>
+      <w:pPr>
+        <w:rPr>
+          <w:color w:val="000000"/>
+        </w:rPr>
+      </w:pPr>
+      <w:r>
+        <w:rPr>
+          <w:color w:val="000000"/>
+        </w:rPr>
+        <w:t xml:space="preserve">• Developed and tested </w:t>
+      </w:r>
+      <w:r>
+        <w:rPr>
+          <w:b/>
+          <w:color w:val="000000"/>
+        </w:rPr>
+        <w:t>biometric enrollment systems</w:t>
+      </w:r>
+      <w:r>
+        <w:rPr>
+          <w:color w:val="000000"/>
+        </w:rPr>
+        <w:t xml:space="preserve"> including </w:t>
+      </w:r>
+      <w:r>
+        <w:rPr>
+          <w:b/>
+          <w:color w:val="000000"/>
+        </w:rPr>
+        <w:t>fingerprint capture</w:t>
+      </w:r>
+      <w:r>
+        <w:rPr>
+          <w:color w:val="000000"/>
+        </w:rPr>
+        <w:t xml:space="preserve">, webcam-based photo acquisition, and </w:t>
+      </w:r>
+      <w:r>
+        <w:rPr>
+          <w:b/>
+          <w:color w:val="000000"/>
+        </w:rPr>
+        <w:t>OCR ID document scanning</w:t>
+      </w:r>
+      <w:r>
+        <w:rPr>
+          <w:color w:val="000000"/>
+        </w:rPr>
+        <w:t xml:space="preserve"> for identity verification</w:t>
+      </w:r>
+    </w:p>
+    <w:p>
+      <w:pPr>
+        <w:rPr>
+          <w:color w:val="000000"/>
+        </w:rPr>
+      </w:pPr>
+      <w:r>
+        <w:rPr>
+          <w:color w:val="000000"/>
+        </w:rPr>
+        <w:t xml:space="preserve">• Operated and maintained </w:t>
+      </w:r>
+      <w:r>
+        <w:rPr>
+          <w:b/>
+          <w:color w:val="000000"/>
+        </w:rPr>
+        <w:t>IT equipment</w:t>
+      </w:r>
+      <w:r>
+        <w:rPr>
+          <w:color w:val="000000"/>
+        </w:rPr>
+        <w:t xml:space="preserve"> ensuring reliable performance during all operations</w:t>
+      </w:r>
+    </w:p>
+    <w:p>
+      <w:pPr>
+        <w:rPr>
+          <w:color w:val="000000"/>
+        </w:rPr>
+      </w:pPr>
+      <w:r>
+        <w:rPr>
+          <w:color w:val="000000"/>
+        </w:rPr>
+        <w:t>• Assisted users through technical processes with patience and clear communication</w:t>
+      </w:r>
+    </w:p>
+    <w:p>
+      <w:pPr>
+        <w:rPr>
+          <w:color w:val="000000"/>
+        </w:rPr>
+      </w:pPr>
+      <w:r>
+        <w:rPr>
+          <w:color w:val="000000"/>
+        </w:rPr>
+        <w:t xml:space="preserve">• Maintained strict </w:t>
+      </w:r>
+      <w:r>
+        <w:rPr>
+          <w:b/>
+          <w:color w:val="000000"/>
+        </w:rPr>
+        <w:t>data security</w:t>
+      </w:r>
+      <w:r>
+        <w:rPr>
+          <w:color w:val="000000"/>
+        </w:rPr>
+        <w:t xml:space="preserve"> protocols when handling sensitive personal information</w:t>
+      </w:r>
+    </w:p>
+    <w:p>
+      <w:pPr>
+        <w:rPr>
+          <w:color w:val="000000"/>
+        </w:rPr>
+      </w:pPr>
+      <w:r>
+        <w:rPr>
+          <w:color w:val="000000"/>
+        </w:rPr>
+        <w:t xml:space="preserve">• Managed multiple tasks simultaneously in </w:t>
+      </w:r>
+      <w:r>
+        <w:rPr>
+          <w:b/>
+          <w:color w:val="000000"/>
+        </w:rPr>
+        <w:t>deadline-driven</w:t>
+      </w:r>
+      <w:r>
+        <w:rPr>
+          <w:color w:val="000000"/>
+        </w:rPr>
+        <w:t xml:space="preserve"> environments</w:t>
+      </w:r>
+    </w:p>
+    <w:p>
+      <w:pPr>
+        <w:rPr>
+          <w:color w:val="000000"/>
+        </w:rPr>
+      </w:pPr>
+    </w:p>
+    <w:p>
+      <w:pPr>
+        <w:rPr>
+          <w:color w:val="000000"/>
+        </w:rPr>
+      </w:pPr>
+      <w:r>
+        <w:rPr>
+          <w:color w:val="000000"/>
+        </w:rPr>
         <w:t>Digital Content &amp; Media Support</w:t>
       </w:r>
     </w:p>
     <w:p>
-      <w:r>
+      <w:pPr>
+        <w:rPr>
+          <w:color w:val="000000"/>
+          <w:sz w:val="20"/>
+        </w:rPr>
+      </w:pPr>
+      <w:r>
+        <w:rPr>
+          <w:color w:val="000000"/>
+          <w:sz w:val="20"/>
+        </w:rPr>
         <w:t>Encounter Church Media Team | 2022 – Present</w:t>
       </w:r>
     </w:p>
     <w:p>
-      <w:r>
-        <w:t>- Provided customer-facing technical support during live events and broadcasts</w:t>
-      </w:r>
-    </w:p>
-    <w:p>
-      <w:r>
-        <w:t>- Managed multimedia equipment and maintained production quality standards</w:t>
-      </w:r>
-    </w:p>
-    <w:p>
-      <w:r>
-        <w:t>- Collaborated with diverse teams to deliver consistent service to audiences of 200+</w:t>
-      </w:r>
-    </w:p>
-    <w:p>
-      <w:r>
-        <w:t>- Developed scripts and coordinated service workflows under tight timelines</w:t>
-      </w:r>
-    </w:p>
-    <w:p/>
-    <w:p>
-      <w:r>
+      <w:pPr>
+        <w:rPr>
+          <w:color w:val="000000"/>
+        </w:rPr>
+      </w:pPr>
+      <w:r>
+        <w:rPr>
+          <w:color w:val="000000"/>
+        </w:rPr>
+        <w:t xml:space="preserve">• Provided </w:t>
+      </w:r>
+      <w:r>
+        <w:rPr>
+          <w:b/>
+          <w:color w:val="000000"/>
+        </w:rPr>
+        <w:t>customer-facing technical support</w:t>
+      </w:r>
+      <w:r>
+        <w:rPr>
+          <w:color w:val="000000"/>
+        </w:rPr>
+        <w:t xml:space="preserve"> during live events and broadcasts</w:t>
+      </w:r>
+    </w:p>
+    <w:p>
+      <w:pPr>
+        <w:rPr>
+          <w:color w:val="000000"/>
+        </w:rPr>
+      </w:pPr>
+      <w:r>
+        <w:rPr>
+          <w:color w:val="000000"/>
+        </w:rPr>
+        <w:t>• Managed multimedia equipment and maintained production quality standards</w:t>
+      </w:r>
+    </w:p>
+    <w:p>
+      <w:pPr>
+        <w:rPr>
+          <w:color w:val="000000"/>
+        </w:rPr>
+      </w:pPr>
+      <w:r>
+        <w:rPr>
+          <w:color w:val="000000"/>
+        </w:rPr>
+        <w:t>• Collaborated with diverse teams to deliver consistent service to audiences of 200+</w:t>
+      </w:r>
+    </w:p>
+    <w:p>
+      <w:pPr>
+        <w:rPr>
+          <w:color w:val="000000"/>
+        </w:rPr>
+      </w:pPr>
+    </w:p>
+    <w:p>
+      <w:pPr>
+        <w:rPr>
+          <w:b/>
+          <w:color w:val="000000"/>
+          <w:sz w:val="26"/>
+          <w:u w:val="single"/>
+        </w:rPr>
+      </w:pPr>
+      <w:r>
+        <w:rPr>
+          <w:b/>
+          <w:color w:val="000000"/>
+          <w:sz w:val="26"/>
+          <w:u w:val="single"/>
+        </w:rPr>
         <w:t>Biometric Systems Project</w:t>
       </w:r>
     </w:p>
     <w:p>
-      <w:r>
+      <w:pPr>
+        <w:rPr>
+          <w:color w:val="000000"/>
+        </w:rPr>
+      </w:pPr>
+      <w:r>
+        <w:rPr>
+          <w:color w:val="000000"/>
+        </w:rPr>
         <w:t>UPDMS — Biometric Enrollment &amp; Identity Verification System</w:t>
       </w:r>
     </w:p>
     <w:p>
-      <w:r>
-        <w:t>- Built fingerprint capture module using browser-based fingerprint API for applicant enrollment</w:t>
-      </w:r>
-    </w:p>
-    <w:p>
-      <w:r>
-        <w:t>- Implemented webcam-based photo capture for identity documentation and record-keeping</w:t>
-      </w:r>
-    </w:p>
-    <w:p>
-      <w:r>
-        <w:t>- Integrated Tesseract.js OCR engine for automated extraction of NIN, name, DOB, and nationality from ID cards</w:t>
-      </w:r>
-    </w:p>
-    <w:p>
-      <w:r>
-        <w:t>- Designed end-to-end workflow ensuring 100% accuracy in biometric data collection and verification</w:t>
-      </w:r>
-    </w:p>
-    <w:p>
-      <w:r>
-        <w:t>- Applied data protection measures to safeguard personally identifiable information</w:t>
-      </w:r>
-    </w:p>
-    <w:p/>
-    <w:p>
-      <w:r>
+      <w:pPr>
+        <w:rPr>
+          <w:color w:val="000000"/>
+        </w:rPr>
+      </w:pPr>
+      <w:r>
+        <w:rPr>
+          <w:color w:val="000000"/>
+        </w:rPr>
+        <w:t xml:space="preserve">• Built </w:t>
+      </w:r>
+      <w:r>
+        <w:rPr>
+          <w:b/>
+          <w:color w:val="000000"/>
+        </w:rPr>
+        <w:t>fingerprint capture</w:t>
+      </w:r>
+      <w:r>
+        <w:rPr>
+          <w:color w:val="000000"/>
+        </w:rPr>
+        <w:t xml:space="preserve"> module using browser-based fingerprint API for applicant enrollment</w:t>
+      </w:r>
+    </w:p>
+    <w:p>
+      <w:pPr>
+        <w:rPr>
+          <w:color w:val="000000"/>
+        </w:rPr>
+      </w:pPr>
+      <w:r>
+        <w:rPr>
+          <w:color w:val="000000"/>
+        </w:rPr>
+        <w:t xml:space="preserve">• Implemented </w:t>
+      </w:r>
+      <w:r>
+        <w:rPr>
+          <w:b/>
+          <w:color w:val="000000"/>
+        </w:rPr>
+        <w:t>webcam-based photo capture</w:t>
+      </w:r>
+      <w:r>
+        <w:rPr>
+          <w:color w:val="000000"/>
+        </w:rPr>
+        <w:t xml:space="preserve"> for identity documentation and record-keeping</w:t>
+      </w:r>
+    </w:p>
+    <w:p>
+      <w:pPr>
+        <w:rPr>
+          <w:color w:val="000000"/>
+        </w:rPr>
+      </w:pPr>
+      <w:r>
+        <w:rPr>
+          <w:color w:val="000000"/>
+        </w:rPr>
+        <w:t xml:space="preserve">• Integrated </w:t>
+      </w:r>
+      <w:r>
+        <w:rPr>
+          <w:b/>
+          <w:color w:val="000000"/>
+        </w:rPr>
+        <w:t>Tesseract.js OCR</w:t>
+      </w:r>
+      <w:r>
+        <w:rPr>
+          <w:color w:val="000000"/>
+        </w:rPr>
+        <w:t xml:space="preserve"> engine for automated extraction of NIN, name, DOB, and nationality from ID cards</w:t>
+      </w:r>
+    </w:p>
+    <w:p>
+      <w:pPr>
+        <w:rPr>
+          <w:color w:val="000000"/>
+        </w:rPr>
+      </w:pPr>
+      <w:r>
+        <w:rPr>
+          <w:color w:val="000000"/>
+        </w:rPr>
+        <w:t xml:space="preserve">• Designed end-to-end workflow ensuring </w:t>
+      </w:r>
+      <w:r>
+        <w:rPr>
+          <w:b/>
+          <w:color w:val="000000"/>
+        </w:rPr>
+        <w:t>100% accuracy</w:t>
+      </w:r>
+      <w:r>
+        <w:rPr>
+          <w:color w:val="000000"/>
+        </w:rPr>
+        <w:t xml:space="preserve"> in biometric data collection and verification</w:t>
+      </w:r>
+    </w:p>
+    <w:p>
+      <w:pPr>
+        <w:rPr>
+          <w:color w:val="000000"/>
+        </w:rPr>
+      </w:pPr>
+      <w:r>
+        <w:rPr>
+          <w:color w:val="000000"/>
+        </w:rPr>
+        <w:t xml:space="preserve">• Applied </w:t>
+      </w:r>
+      <w:r>
+        <w:rPr>
+          <w:b/>
+          <w:color w:val="000000"/>
+        </w:rPr>
+        <w:t>data protection</w:t>
+      </w:r>
+      <w:r>
+        <w:rPr>
+          <w:color w:val="000000"/>
+        </w:rPr>
+        <w:t xml:space="preserve"> measures to safeguard personally identifiable information</w:t>
+      </w:r>
+    </w:p>
+    <w:p>
+      <w:pPr>
+        <w:rPr>
+          <w:color w:val="000000"/>
+        </w:rPr>
+      </w:pPr>
+    </w:p>
+    <w:p>
+      <w:pPr>
+        <w:rPr>
+          <w:b/>
+          <w:color w:val="000000"/>
+          <w:sz w:val="26"/>
+          <w:u w:val="single"/>
+        </w:rPr>
+      </w:pPr>
+      <w:r>
+        <w:rPr>
+          <w:b/>
+          <w:color w:val="000000"/>
+          <w:sz w:val="26"/>
+          <w:u w:val="single"/>
+        </w:rPr>
         <w:t>Languages</w:t>
       </w:r>
     </w:p>
     <w:p>
-      <w:r>
-        <w:t>- English — Fluent (written and spoken)</w:t>
-      </w:r>
-    </w:p>
-    <w:p>
-      <w:r>
-        <w:t>- Luganda — Fluent (written and spoken)</w:t>
-      </w:r>
-    </w:p>
-    <w:p/>
-    <w:p>
-      <w:r>
+      <w:pPr>
+        <w:rPr>
+          <w:color w:val="000000"/>
+        </w:rPr>
+      </w:pPr>
+      <w:r>
+        <w:rPr>
+          <w:color w:val="000000"/>
+        </w:rPr>
+        <w:t xml:space="preserve">• </w:t>
+      </w:r>
+      <w:r>
+        <w:rPr>
+          <w:b/>
+          <w:color w:val="000000"/>
+        </w:rPr>
+        <w:t>English</w:t>
+      </w:r>
+      <w:r>
+        <w:rPr>
+          <w:color w:val="000000"/>
+        </w:rPr>
+        <w:t xml:space="preserve"> — Fluent (written and spoken)</w:t>
+      </w:r>
+    </w:p>
+    <w:p>
+      <w:pPr>
+        <w:rPr>
+          <w:color w:val="000000"/>
+        </w:rPr>
+      </w:pPr>
+      <w:r>
+        <w:rPr>
+          <w:color w:val="000000"/>
+        </w:rPr>
+        <w:t xml:space="preserve">• </w:t>
+      </w:r>
+      <w:r>
+        <w:rPr>
+          <w:b/>
+          <w:color w:val="000000"/>
+        </w:rPr>
+        <w:t>Luganda</w:t>
+      </w:r>
+      <w:r>
+        <w:rPr>
+          <w:color w:val="000000"/>
+        </w:rPr>
+        <w:t xml:space="preserve"> — Fluent (written and spoken)</w:t>
+      </w:r>
+    </w:p>
+    <w:p>
+      <w:pPr>
+        <w:rPr>
+          <w:color w:val="000000"/>
+        </w:rPr>
+      </w:pPr>
+    </w:p>
+    <w:p>
+      <w:pPr>
+        <w:rPr>
+          <w:b/>
+          <w:color w:val="000000"/>
+          <w:sz w:val="26"/>
+          <w:u w:val="single"/>
+        </w:rPr>
+      </w:pPr>
+      <w:r>
+        <w:rPr>
+          <w:b/>
+          <w:color w:val="000000"/>
+          <w:sz w:val="26"/>
+          <w:u w:val="single"/>
+        </w:rPr>
         <w:t>Availability</w:t>
       </w:r>
     </w:p>
     <w:p>
-      <w:r>
+      <w:pPr>
+        <w:rPr>
+          <w:color w:val="000000"/>
+        </w:rPr>
+      </w:pPr>
+      <w:r>
+        <w:rPr>
+          <w:b/>
+          <w:color w:val="000000"/>
+        </w:rPr>
         <w:t>Immediate / ASAP</w:t>
       </w:r>
     </w:p>
-    <w:p/>
-    <w:p>
-      <w:r>
+    <w:p>
+      <w:pPr>
+        <w:rPr>
+          <w:color w:val="000000"/>
+        </w:rPr>
+      </w:pPr>
+    </w:p>
+    <w:p>
+      <w:pPr>
+        <w:rPr>
+          <w:b/>
+          <w:color w:val="000000"/>
+          <w:sz w:val="26"/>
+          <w:u w:val="single"/>
+        </w:rPr>
+      </w:pPr>
+      <w:r>
+        <w:rPr>
+          <w:b/>
+          <w:color w:val="000000"/>
+          <w:sz w:val="26"/>
+          <w:u w:val="single"/>
+        </w:rPr>
         <w:t>Referees</w:t>
       </w:r>
     </w:p>
     <w:p>
-      <w:r>
+      <w:pPr>
+        <w:rPr>
+          <w:color w:val="000000"/>
+        </w:rPr>
+      </w:pPr>
+      <w:r>
+        <w:rPr>
+          <w:color w:val="000000"/>
+        </w:rPr>
         <w:t>Professional Referees:</w:t>
       </w:r>
     </w:p>
     <w:p>
-      <w:r>
+      <w:pPr>
+        <w:rPr>
+          <w:color w:val="000000"/>
+        </w:rPr>
+      </w:pPr>
+      <w:r>
+        <w:rPr>
+          <w:color w:val="000000"/>
+        </w:rPr>
         <w:t>1. Kato Kenneth — Lecturer, ISBAT University | Tel: 0760 220 536</w:t>
       </w:r>
     </w:p>
     <w:p>
-      <w:r>
+      <w:pPr>
+        <w:rPr>
+          <w:color w:val="000000"/>
+        </w:rPr>
+      </w:pPr>
+      <w:r>
+        <w:rPr>
+          <w:color w:val="000000"/>
+        </w:rPr>
         <w:t>2. Chitra G. Sasi — Lecturer, ISBAT University | Tel: 0754 411 927</w:t>
       </w:r>
     </w:p>
     <w:p>
-      <w:r>
+      <w:pPr>
+        <w:rPr>
+          <w:color w:val="000000"/>
+        </w:rPr>
+      </w:pPr>
+    </w:p>
+    <w:p>
+      <w:pPr>
+        <w:rPr>
+          <w:color w:val="000000"/>
+        </w:rPr>
+      </w:pPr>
+      <w:r>
+        <w:rPr>
+          <w:color w:val="000000"/>
+        </w:rPr>
         <w:t>Character Referees:</w:t>
       </w:r>
     </w:p>
     <w:p>
-      <w:r>
+      <w:pPr>
+        <w:rPr>
+          <w:color w:val="000000"/>
+        </w:rPr>
+      </w:pPr>
+      <w:r>
+        <w:rPr>
+          <w:color w:val="000000"/>
+        </w:rPr>
         <w:t>1. Nanyanzi Pamela — Advocate &amp; Church Chairman | Tel: 0779 827 270</w:t>
       </w:r>
     </w:p>
     <w:p>
-      <w:r>
+      <w:pPr>
+        <w:rPr>
+          <w:color w:val="000000"/>
+        </w:rPr>
+      </w:pPr>
+      <w:r>
+        <w:rPr>
+          <w:color w:val="000000"/>
+        </w:rPr>
         <w:t>2. Nangobi Hellen Hilda — Community Member | Tel: 0754 007 779</w:t>
       </w:r>
+    </w:p>
+    <w:p>
+      <w:pPr>
+        <w:rPr>
+          <w:color w:val="000000"/>
+        </w:rPr>
+      </w:pPr>
       <w:bookmarkStart w:id="0" w:name="_GoBack"/>
       <w:bookmarkEnd w:id="0"/>
     </w:p>

</xml_diff>

<commit_message>
Correct full degree name: Bachelor of Science in Applied Information Technology (B.Sc. AIT), add to CVs
</commit_message>
<xml_diff>
--- a/Jondu_Jesse_CV.docx
+++ b/Jondu_Jesse_CV.docx
@@ -428,38 +428,36 @@
           <w:color w:val="000000"/>
         </w:rPr>
       </w:pPr>
-      <w:r>
-        <w:rPr>
-          <w:b/>
-          <w:color w:val="000000"/>
+      <w:r/>
+      <w:r>
+        <w:rPr>
+          <w:b/>
+        </w:rPr>
+        <w:t>Bachelor of Science in Applied Information Technology (B.Sc. AIT)</w:t>
+      </w:r>
+    </w:p>
+    <w:p>
+      <w:pPr>
+        <w:rPr>
+          <w:color w:val="000000"/>
+        </w:rPr>
+      </w:pPr>
+      <w:r>
+        <w:t>ISBAT University, Kampala | Currently pursuing (2nd year completed)</w:t>
+      </w:r>
+    </w:p>
+    <w:p>
+      <w:r/>
+      <w:r>
+        <w:rPr>
+          <w:b/>
         </w:rPr>
         <w:t>Diploma in Information Technology</w:t>
       </w:r>
-      <w:r>
-        <w:rPr>
-          <w:color w:val="000000"/>
-        </w:rPr>
-        <w:t xml:space="preserve"> — ISBAT University, Kampala</w:t>
-      </w:r>
-    </w:p>
-    <w:p>
-      <w:pPr>
-        <w:rPr>
-          <w:color w:val="000000"/>
-        </w:rPr>
-      </w:pPr>
-      <w:r>
-        <w:rPr>
-          <w:b/>
-          <w:color w:val="000000"/>
-        </w:rPr>
-        <w:t>Final Semester Completed (June 2026)</w:t>
-      </w:r>
-      <w:r>
-        <w:rPr>
-          <w:color w:val="000000"/>
-        </w:rPr>
-        <w:t xml:space="preserve"> — Coursework includes database management, networking, systems analysis, and IT security</w:t>
+    </w:p>
+    <w:p>
+      <w:r>
+        <w:t>ISBAT University, Kampala | Completed (Jan 2023 - Jun 2026)</w:t>
       </w:r>
     </w:p>
     <w:p>

</xml_diff>

<commit_message>
Add volunteer experience section (Church Registration, Dairy System, Media Team) to CVs; fix diploma years 2024-2025 and B.Sc. AIT 2026-present
</commit_message>
<xml_diff>
--- a/Jondu_Jesse_CV.docx
+++ b/Jondu_Jesse_CV.docx
@@ -443,7 +443,7 @@
         </w:rPr>
       </w:pPr>
       <w:r>
-        <w:t>ISBAT University, Kampala | Currently pursuing (2nd year completed)</w:t>
+        <w:t>ISBAT University, Kampala | 2026 — Present (pursuing)</w:t>
       </w:r>
     </w:p>
     <w:p>
@@ -457,7 +457,7 @@
     </w:p>
     <w:p>
       <w:r>
-        <w:t>ISBAT University, Kampala | Completed (Jan 2023 - Jun 2026)</w:t>
+        <w:t>ISBAT University, Kampala | 2024 — 2025 (Completed)</w:t>
       </w:r>
     </w:p>
     <w:p>
@@ -919,6 +919,141 @@
           <w:color w:val="000000"/>
         </w:rPr>
       </w:pPr>
+    </w:p>
+    <w:p>
+      <w:r/>
+      <w:r>
+        <w:rPr>
+          <w:b/>
+          <w:sz w:val="26"/>
+        </w:rPr>
+        <w:t>SYSTEM DEVELOPMENT &amp; RECORDS</w:t>
+      </w:r>
+    </w:p>
+    <w:p>
+      <w:r/>
+      <w:r>
+        <w:rPr>
+          <w:sz w:val="22"/>
+        </w:rPr>
+      </w:r>
+    </w:p>
+    <w:p>
+      <w:r/>
+      <w:r>
+        <w:rPr>
+          <w:b/>
+          <w:sz w:val="22"/>
+        </w:rPr>
+        <w:t>Church Registration System Developer</w:t>
+      </w:r>
+    </w:p>
+    <w:p>
+      <w:r/>
+      <w:r>
+        <w:rPr>
+          <w:sz w:val="22"/>
+        </w:rPr>
+        <w:t>Grace of Jesus Christ Ministries | 2024 - Present</w:t>
+      </w:r>
+    </w:p>
+    <w:p>
+      <w:r/>
+      <w:r>
+        <w:rPr>
+          <w:sz w:val="22"/>
+        </w:rPr>
+        <w:t xml:space="preserve">   • Designed and deployed a registration platform capturing and maintaining member records with strict data accuracy and confidentiality protocols</w:t>
+      </w:r>
+    </w:p>
+    <w:p>
+      <w:r/>
+      <w:r>
+        <w:rPr>
+          <w:sz w:val="22"/>
+        </w:rPr>
+        <w:t xml:space="preserve">   • Implemented role-based access controls and audit trails to ensure data integrity</w:t>
+      </w:r>
+    </w:p>
+    <w:p>
+      <w:r/>
+      <w:r>
+        <w:rPr>
+          <w:sz w:val="22"/>
+        </w:rPr>
+        <w:t xml:space="preserve">   • Managed sensitive personal information in compliance with data protection principles</w:t>
+      </w:r>
+    </w:p>
+    <w:p>
+      <w:r/>
+      <w:r>
+        <w:rPr>
+          <w:sz w:val="22"/>
+        </w:rPr>
+        <w:t xml:space="preserve">   • Developed reporting dashboards for membership statistics and attendance tracking</w:t>
+      </w:r>
+    </w:p>
+    <w:p>
+      <w:r/>
+      <w:r>
+        <w:rPr>
+          <w:sz w:val="22"/>
+        </w:rPr>
+      </w:r>
+    </w:p>
+    <w:p>
+      <w:r/>
+      <w:r>
+        <w:rPr>
+          <w:b/>
+          <w:sz w:val="22"/>
+        </w:rPr>
+        <w:t>Dairy Management System Developer</w:t>
+      </w:r>
+    </w:p>
+    <w:p>
+      <w:r/>
+      <w:r>
+        <w:rPr>
+          <w:sz w:val="22"/>
+        </w:rPr>
+        <w:t>[Farm/Organization Name] | 2024 - Present</w:t>
+      </w:r>
+    </w:p>
+    <w:p>
+      <w:r/>
+      <w:r>
+        <w:rPr>
+          <w:sz w:val="22"/>
+        </w:rPr>
+        <w:t xml:space="preserve">   • Built a full-stack PHP/MySQL system managing operational records: animal inventory, milk production logs, health checks, feeding, and financial transactions</w:t>
+      </w:r>
+    </w:p>
+    <w:p>
+      <w:r/>
+      <w:r>
+        <w:rPr>
+          <w:sz w:val="22"/>
+        </w:rPr>
+        <w:t xml:space="preserve">   • Designed data capture interfaces with validation checks to ensure accurate daily data entry</w:t>
+      </w:r>
+    </w:p>
+    <w:p>
+      <w:r/>
+      <w:r>
+        <w:rPr>
+          <w:sz w:val="22"/>
+        </w:rPr>
+        <w:t xml:space="preserve">   • Created reporting features for production tracking and performance analysis</w:t>
+      </w:r>
+    </w:p>
+    <w:p>
+      <w:r/>
+      <w:r>
+        <w:rPr>
+          <w:sz w:val="22"/>
+        </w:rPr>
+      </w:r>
     </w:p>
     <w:p>
       <w:pPr>

</xml_diff>

<commit_message>
Reframe volunteer experience to data-entry/records focus for data clerk roles
</commit_message>
<xml_diff>
--- a/Jondu_Jesse_CV.docx
+++ b/Jondu_Jesse_CV.docx
@@ -939,116 +939,183 @@
       </w:r>
     </w:p>
     <w:p>
-      <w:r/>
-      <w:r>
-        <w:rPr>
-          <w:b/>
-          <w:sz w:val="22"/>
-        </w:rPr>
-        <w:t>Church Registration System Developer</w:t>
-      </w:r>
-    </w:p>
-    <w:p>
-      <w:r/>
-      <w:r>
-        <w:rPr>
+      <w:r>
+        <w:rPr>
+          <w:b/>
+          <w:sz w:val="22"/>
+        </w:rPr>
+        <w:t>Church Registration Records &amp; Data Management</w:t>
+      </w:r>
+      <w:r>
+        <w:rPr>
+          <w:b/>
+          <w:sz w:val="22"/>
+        </w:rPr>
+      </w:r>
+    </w:p>
+    <w:p>
+      <w:r>
+        <w:rPr>
+          <w:b w:val="0"/>
           <w:sz w:val="22"/>
         </w:rPr>
         <w:t>Grace of Jesus Christ Ministries | 2024 - Present</w:t>
       </w:r>
-    </w:p>
-    <w:p>
-      <w:r/>
-      <w:r>
-        <w:rPr>
-          <w:sz w:val="22"/>
-        </w:rPr>
-        <w:t xml:space="preserve">   • Designed and deployed a registration platform capturing and maintaining member records with strict data accuracy and confidentiality protocols</w:t>
-      </w:r>
-    </w:p>
-    <w:p>
-      <w:r/>
-      <w:r>
-        <w:rPr>
-          <w:sz w:val="22"/>
-        </w:rPr>
-        <w:t xml:space="preserve">   • Implemented role-based access controls and audit trails to ensure data integrity</w:t>
-      </w:r>
-    </w:p>
-    <w:p>
-      <w:r/>
-      <w:r>
-        <w:rPr>
-          <w:sz w:val="22"/>
-        </w:rPr>
-        <w:t xml:space="preserve">   • Managed sensitive personal information in compliance with data protection principles</w:t>
-      </w:r>
-    </w:p>
-    <w:p>
-      <w:r/>
-      <w:r>
-        <w:rPr>
-          <w:sz w:val="22"/>
-        </w:rPr>
-        <w:t xml:space="preserve">   • Developed reporting dashboards for membership statistics and attendance tracking</w:t>
-      </w:r>
-    </w:p>
-    <w:p>
-      <w:r/>
-      <w:r>
-        <w:rPr>
-          <w:sz w:val="22"/>
-        </w:rPr>
-      </w:r>
-    </w:p>
-    <w:p>
-      <w:r/>
-      <w:r>
-        <w:rPr>
-          <w:b/>
-          <w:sz w:val="22"/>
-        </w:rPr>
-        <w:t>Dairy Management System Developer</w:t>
-      </w:r>
-    </w:p>
-    <w:p>
-      <w:r/>
-      <w:r>
-        <w:rPr>
-          <w:sz w:val="22"/>
-        </w:rPr>
-        <w:t>[Farm/Organization Name] | 2024 - Present</w:t>
-      </w:r>
-    </w:p>
-    <w:p>
-      <w:r/>
-      <w:r>
-        <w:rPr>
-          <w:sz w:val="22"/>
-        </w:rPr>
-        <w:t xml:space="preserve">   • Built a full-stack PHP/MySQL system managing operational records: animal inventory, milk production logs, health checks, feeding, and financial transactions</w:t>
-      </w:r>
-    </w:p>
-    <w:p>
-      <w:r/>
-      <w:r>
-        <w:rPr>
-          <w:sz w:val="22"/>
-        </w:rPr>
-        <w:t xml:space="preserve">   • Designed data capture interfaces with validation checks to ensure accurate daily data entry</w:t>
-      </w:r>
-    </w:p>
-    <w:p>
-      <w:r/>
-      <w:r>
-        <w:rPr>
-          <w:sz w:val="22"/>
-        </w:rPr>
-        <w:t xml:space="preserve">   • Created reporting features for production tracking and performance analysis</w:t>
-      </w:r>
-    </w:p>
-    <w:p>
-      <w:r/>
+      <w:r>
+        <w:rPr>
+          <w:sz w:val="22"/>
+        </w:rPr>
+      </w:r>
+    </w:p>
+    <w:p>
+      <w:r>
+        <w:rPr>
+          <w:b/>
+          <w:sz w:val="22"/>
+        </w:rPr>
+        <w:t xml:space="preserve">   • Enter, verify, and maintain member registration records (name, contact, membership details) in a digital database, ensuring accuracy and completeness against source forms</w:t>
+      </w:r>
+      <w:r>
+        <w:rPr>
+          <w:sz w:val="22"/>
+        </w:rPr>
+      </w:r>
+    </w:p>
+    <w:p>
+      <w:r>
+        <w:rPr>
+          <w:b/>
+          <w:sz w:val="22"/>
+        </w:rPr>
+        <w:t xml:space="preserve">   • Process registrations during services/events, capturing data quickly and accurately under time pressure</w:t>
+      </w:r>
+      <w:r>
+        <w:rPr>
+          <w:sz w:val="22"/>
+        </w:rPr>
+      </w:r>
+    </w:p>
+    <w:p>
+      <w:r>
+        <w:rPr>
+          <w:b/>
+          <w:sz w:val="22"/>
+        </w:rPr>
+        <w:t xml:space="preserve">   • Perform daily record reconciliation, identifying and correcting data discrepancies or duplicate entries</w:t>
+      </w:r>
+      <w:r>
+        <w:rPr>
+          <w:sz w:val="22"/>
+        </w:rPr>
+      </w:r>
+    </w:p>
+    <w:p>
+      <w:r>
+        <w:rPr>
+          <w:b/>
+          <w:sz w:val="22"/>
+        </w:rPr>
+        <w:t xml:space="preserve">   • Maintain confidential handling of personal information and audit-ready, easily retrievable records</w:t>
+      </w:r>
+      <w:r>
+        <w:rPr>
+          <w:sz w:val="22"/>
+        </w:rPr>
+      </w:r>
+    </w:p>
+    <w:p>
+      <w:r>
+        <w:rPr>
+          <w:b/>
+          <w:sz w:val="22"/>
+        </w:rPr>
+        <w:t xml:space="preserve">   • Produce registrations/attendance summaries and reports for administrative use</w:t>
+      </w:r>
+      <w:r>
+        <w:rPr>
+          <w:sz w:val="22"/>
+        </w:rPr>
+      </w:r>
+    </w:p>
+    <w:p>
+      <w:r>
+        <w:rPr>
+          <w:b/>
+          <w:sz w:val="22"/>
+        </w:rPr>
+        <w:t>Operational Records &amp; Data System</w:t>
+      </w:r>
+      <w:r>
+        <w:rPr>
+          <w:b/>
+          <w:sz w:val="22"/>
+        </w:rPr>
+      </w:r>
+    </w:p>
+    <w:p>
+      <w:r>
+        <w:rPr>
+          <w:b w:val="0"/>
+          <w:sz w:val="22"/>
+        </w:rPr>
+        <w:t>Dairy Management | 2024 - Present</w:t>
+      </w:r>
+      <w:r>
+        <w:rPr>
+          <w:sz w:val="22"/>
+        </w:rPr>
+      </w:r>
+    </w:p>
+    <w:p>
+      <w:r>
+        <w:rPr>
+          <w:b/>
+          <w:sz w:val="22"/>
+        </w:rPr>
+        <w:t xml:space="preserve">   • Capture and maintain detailed daily operational records (inventory, production logs, health schedules, feeding, transactions) in a database, entering data accurately from day-to-day records</w:t>
+      </w:r>
+      <w:r>
+        <w:rPr>
+          <w:sz w:val="22"/>
+        </w:rPr>
+      </w:r>
+    </w:p>
+    <w:p>
+      <w:r>
+        <w:rPr>
+          <w:b/>
+          <w:sz w:val="22"/>
+        </w:rPr>
+        <w:t xml:space="preserve">   • Verify data against source documents and application input validation to ensure completeness and accuracy</w:t>
+      </w:r>
+      <w:r>
+        <w:rPr>
+          <w:sz w:val="22"/>
+        </w:rPr>
+      </w:r>
+    </w:p>
+    <w:p>
+      <w:r>
+        <w:rPr>
+          <w:b/>
+          <w:sz w:val="22"/>
+        </w:rPr>
+        <w:t xml:space="preserve">   • Safeguard departmental records for easy retrieval and audit purposes</w:t>
+      </w:r>
+      <w:r>
+        <w:rPr>
+          <w:sz w:val="22"/>
+        </w:rPr>
+      </w:r>
+    </w:p>
+    <w:p>
+      <w:r>
+        <w:rPr>
+          <w:b/>
+          <w:sz w:val="22"/>
+        </w:rPr>
+        <w:t xml:space="preserve">   • Prepare monthly production and expense summaries/reports</w:t>
+      </w:r>
       <w:r>
         <w:rPr>
           <w:sz w:val="22"/>

</xml_diff>

<commit_message>
Add quantitative metrics to volunteer records experience (500+ records, 20+ registrations/service)
</commit_message>
<xml_diff>
--- a/Jondu_Jesse_CV.docx
+++ b/Jondu_Jesse_CV.docx
@@ -973,21 +973,21 @@
           <w:b/>
           <w:sz w:val="22"/>
         </w:rPr>
-        <w:t xml:space="preserve">   • Enter, verify, and maintain member registration records (name, contact, membership details) in a digital database, ensuring accuracy and completeness against source forms</w:t>
-      </w:r>
-      <w:r>
-        <w:rPr>
-          <w:sz w:val="22"/>
-        </w:rPr>
-      </w:r>
-    </w:p>
-    <w:p>
-      <w:r>
-        <w:rPr>
-          <w:b/>
-          <w:sz w:val="22"/>
-        </w:rPr>
-        <w:t xml:space="preserve">   • Process registrations during services/events, capturing data quickly and accurately under time pressure</w:t>
+        <w:t xml:space="preserve">   • Enter, verify, and maintain 500+ member registration records (name, contact, membership details) in a digital database, ensuring accuracy and completeness against source forms</w:t>
+      </w:r>
+      <w:r>
+        <w:rPr>
+          <w:sz w:val="22"/>
+        </w:rPr>
+      </w:r>
+    </w:p>
+    <w:p>
+      <w:r>
+        <w:rPr>
+          <w:b/>
+          <w:sz w:val="22"/>
+        </w:rPr>
+        <w:t xml:space="preserve">   • Process 20+ registrations per service/event, capturing data quickly and accurately under time pressure</w:t>
       </w:r>
       <w:r>
         <w:rPr>

</xml_diff>